<commit_message>
fix(talabnoma): detect the other company and its legal form from the Excel and write them on the letter
The parser found the two parties only for one combination of legal forms, and the view then
ignored what it found and printed the sample debtor. Now both companies and their forms are read
from the sheet's header whatever they are (AO, OOO, SP OOO, CHP, IP, GUP, GU), typed values win,
and the sample's name, legal form and address are used only while the sheet names nobody. The
templates write the form from {{debtor_form}}. A missing debtor address is asked for.

Co-Authored-By: Claude Sonnet 5.5 <noreply@anthropic.com>
Claude-Session: https://claude.ai/code/session_017Bvkx3qJgxasWy8CRohMRx
</commit_message>
<xml_diff>
--- a/src/lib/documents/templates/pretenzia.docx
+++ b/src/lib/documents/templates/pretenzia.docx
@@ -219,7 +219,7 @@
                 <w:szCs w:val="28"/>
                 <w:lang w:val="ru-RU"/>
               </w:rPr>
-              <w:t>АО «</w:t>
+              <w:t xml:space="preserve">{{debtor_form}} «{{debtor_name}}»</w:t>
             </w:r>
             <w:r>
               <w:rPr>
@@ -229,7 +229,7 @@
                 <w:szCs w:val="28"/>
                 <w:lang w:val="ru-RU"/>
               </w:rPr>
-              <w:t xml:space="preserve">{{debtor_name}}</w:t>
+              <w:t xml:space="preserve"/>
             </w:r>
             <w:r>
               <w:rPr>
@@ -252,7 +252,7 @@
                 <w:u w:val="single"/>
                 <w:lang w:val="ru-RU"/>
               </w:rPr>
-              <w:t>»</w:t>
+              <w:t xml:space="preserve"/>
             </w:r>
             <w:r>
               <w:rPr>
@@ -380,7 +380,7 @@
           <w:szCs w:val="28"/>
           <w:lang w:val="ru-RU"/>
         </w:rPr>
-        <w:t xml:space="preserve">ООО «{{creditor_name}}» и АО «{{debtor_name}}» был заключён нижеуказанный договор, по которому со стороны Покупателя обязательства по оплате надлежащим образом не исполнялись:</w:t>
+        <w:t xml:space="preserve">ООО «{{creditor_name}}» и {{debtor_form}} «{{debtor_name}}» был заключён нижеуказанный договор, по которому со стороны Покупателя обязательства по оплате надлежащим образом не исполнялись:</w:t>
       </w:r>
     </w:p>
     <w:p>
@@ -780,20 +780,12 @@
           <w:szCs w:val="28"/>
           <w:lang w:val="ru-RU"/>
         </w:rPr>
-        <w:t>АО «</w:t>
-      </w:r>
-      <w:r>
-        <w:rPr>
-          <w:sz w:val="28"/>
-          <w:szCs w:val="28"/>
-        </w:rPr>
-        <w:t xml:space="preserve">{{debtor_name}}</w:t>
-      </w:r>
-      <w:r>
-        <w:rPr>
-          <w:sz w:val="28"/>
-          <w:szCs w:val="28"/>
-          <w:lang w:val="ru-RU"/>
+        <w:t xml:space="preserve">{{debtor_form}} «{{debtor_name}}»</w:t>
+      </w:r>
+      <w:r>
+        <w:rPr>
+          <w:sz w:val="28"/>
+          <w:szCs w:val="28"/>
         </w:rPr>
         <w:t xml:space="preserve"/>
       </w:r>
@@ -801,6 +793,7 @@
         <w:rPr>
           <w:sz w:val="28"/>
           <w:szCs w:val="28"/>
+          <w:lang w:val="ru-RU"/>
         </w:rPr>
         <w:t xml:space="preserve"/>
       </w:r>
@@ -808,7 +801,6 @@
         <w:rPr>
           <w:sz w:val="28"/>
           <w:szCs w:val="28"/>
-          <w:lang w:val="ru-RU"/>
         </w:rPr>
         <w:t xml:space="preserve"/>
       </w:r>
@@ -816,6 +808,7 @@
         <w:rPr>
           <w:sz w:val="28"/>
           <w:szCs w:val="28"/>
+          <w:lang w:val="ru-RU"/>
         </w:rPr>
         <w:t xml:space="preserve"/>
       </w:r>
@@ -823,9 +816,16 @@
         <w:rPr>
           <w:sz w:val="28"/>
           <w:szCs w:val="28"/>
-          <w:lang w:val="ru-RU"/>
-        </w:rPr>
-        <w:t xml:space="preserve">» </w:t>
+        </w:rPr>
+        <w:t xml:space="preserve"/>
+      </w:r>
+      <w:r>
+        <w:rPr>
+          <w:sz w:val="28"/>
+          <w:szCs w:val="28"/>
+          <w:lang w:val="ru-RU"/>
+        </w:rPr>
+        <w:t xml:space="preserve"> </w:t>
       </w:r>
       <w:r>
         <w:rPr>

</xml_diff>